<commit_message>
Update testing data for hashes
</commit_message>
<xml_diff>
--- a/funkcje_skrotu/Funkcje_skrotu_sprawozdanie.docx
+++ b/funkcje_skrotu/Funkcje_skrotu_sprawozdanie.docx
@@ -185,6 +185,7 @@
       </w:pPr>
       <w:r>
         <w:rPr>
+          <w:noProof/>
           <w:lang w:val="pl-PL"/>
         </w:rPr>
         <w:drawing>
@@ -234,6 +235,7 @@
       </w:pPr>
       <w:r>
         <w:rPr>
+          <w:noProof/>
           <w:lang w:val="pl-PL"/>
         </w:rPr>
         <w:lastRenderedPageBreak/>
@@ -284,6 +286,7 @@
       </w:pPr>
       <w:r>
         <w:rPr>
+          <w:noProof/>
           <w:lang w:val="pl-PL"/>
         </w:rPr>
         <w:drawing>
@@ -331,16 +334,70 @@
           <w:lang w:val="pl-PL"/>
         </w:rPr>
       </w:pPr>
+    </w:p>
+    <w:p>
+      <w:pPr>
+        <w:pStyle w:val="Akapitzlist"/>
+        <w:jc w:val="both"/>
+        <w:rPr>
+          <w:lang w:val="pl-PL"/>
+        </w:rPr>
+      </w:pPr>
+    </w:p>
+    <w:p>
+      <w:pPr>
+        <w:pStyle w:val="Akapitzlist"/>
+        <w:jc w:val="both"/>
+        <w:rPr>
+          <w:lang w:val="pl-PL"/>
+        </w:rPr>
+      </w:pPr>
+    </w:p>
+    <w:p>
+      <w:pPr>
+        <w:pStyle w:val="Akapitzlist"/>
+        <w:jc w:val="both"/>
+        <w:rPr>
+          <w:lang w:val="pl-PL"/>
+        </w:rPr>
+      </w:pPr>
+    </w:p>
+    <w:p>
+      <w:pPr>
+        <w:pStyle w:val="Akapitzlist"/>
+        <w:jc w:val="both"/>
+        <w:rPr>
+          <w:lang w:val="pl-PL"/>
+        </w:rPr>
+      </w:pPr>
+    </w:p>
+    <w:p>
+      <w:pPr>
+        <w:pStyle w:val="Akapitzlist"/>
+        <w:jc w:val="both"/>
+        <w:rPr>
+          <w:lang w:val="pl-PL"/>
+        </w:rPr>
+      </w:pPr>
+    </w:p>
+    <w:p>
+      <w:pPr>
+        <w:pStyle w:val="Akapitzlist"/>
+        <w:jc w:val="both"/>
+        <w:rPr>
+          <w:lang w:val="pl-PL"/>
+        </w:rPr>
+      </w:pPr>
       <w:r>
         <w:rPr>
           <w:lang w:val="pl-PL"/>
         </w:rPr>
         <w:lastRenderedPageBreak/>
         <w:drawing>
-          <wp:inline distT="0" distB="0" distL="0" distR="0" wp14:anchorId="27AC9750" wp14:editId="303DF3E5">
-            <wp:extent cx="5884545" cy="4168000"/>
-            <wp:effectExtent l="0" t="0" r="1905" b="4445"/>
-            <wp:docPr id="1162816071" name="Obraz 1"/>
+          <wp:inline distT="0" distB="0" distL="0" distR="0" wp14:anchorId="373611C3" wp14:editId="5AF709C4">
+            <wp:extent cx="5760720" cy="3876675"/>
+            <wp:effectExtent l="0" t="0" r="0" b="9525"/>
+            <wp:docPr id="584154293" name="Obraz 1"/>
             <wp:cNvGraphicFramePr>
               <a:graphicFrameLocks xmlns:a="http://schemas.openxmlformats.org/drawingml/2006/main" noChangeAspect="1"/>
             </wp:cNvGraphicFramePr>
@@ -348,7 +405,7 @@
               <a:graphicData uri="http://schemas.openxmlformats.org/drawingml/2006/picture">
                 <pic:pic xmlns:pic="http://schemas.openxmlformats.org/drawingml/2006/picture">
                   <pic:nvPicPr>
-                    <pic:cNvPr id="1162816071" name=""/>
+                    <pic:cNvPr id="584154293" name=""/>
                     <pic:cNvPicPr/>
                   </pic:nvPicPr>
                   <pic:blipFill>
@@ -360,7 +417,7 @@
                   <pic:spPr>
                     <a:xfrm>
                       <a:off x="0" y="0"/>
-                      <a:ext cx="5892903" cy="4173920"/>
+                      <a:ext cx="5760720" cy="3876675"/>
                     </a:xfrm>
                     <a:prstGeom prst="rect">
                       <a:avLst/>
@@ -386,10 +443,10 @@
           <w:lang w:val="pl-PL"/>
         </w:rPr>
         <w:drawing>
-          <wp:inline distT="0" distB="0" distL="0" distR="0" wp14:anchorId="79852AA1" wp14:editId="54FD8A7D">
-            <wp:extent cx="5884606" cy="3278038"/>
-            <wp:effectExtent l="0" t="0" r="1905" b="0"/>
-            <wp:docPr id="466131715" name="Obraz 1"/>
+          <wp:inline distT="0" distB="0" distL="0" distR="0" wp14:anchorId="6D5AD3D5" wp14:editId="35E0FD1F">
+            <wp:extent cx="5855335" cy="2457450"/>
+            <wp:effectExtent l="0" t="0" r="0" b="0"/>
+            <wp:docPr id="1699768471" name="Obraz 1"/>
             <wp:cNvGraphicFramePr>
               <a:graphicFrameLocks xmlns:a="http://schemas.openxmlformats.org/drawingml/2006/main" noChangeAspect="1"/>
             </wp:cNvGraphicFramePr>
@@ -397,7 +454,7 @@
               <a:graphicData uri="http://schemas.openxmlformats.org/drawingml/2006/picture">
                 <pic:pic xmlns:pic="http://schemas.openxmlformats.org/drawingml/2006/picture">
                   <pic:nvPicPr>
-                    <pic:cNvPr id="466131715" name=""/>
+                    <pic:cNvPr id="1699768471" name=""/>
                     <pic:cNvPicPr/>
                   </pic:nvPicPr>
                   <pic:blipFill>
@@ -409,7 +466,7 @@
                   <pic:spPr>
                     <a:xfrm>
                       <a:off x="0" y="0"/>
-                      <a:ext cx="5892225" cy="3282282"/>
+                      <a:ext cx="5858438" cy="2458752"/>
                     </a:xfrm>
                     <a:prstGeom prst="rect">
                       <a:avLst/>
@@ -479,6 +536,40 @@
     <w:p>
       <w:pPr>
         <w:pStyle w:val="Akapitzlist"/>
+        <w:jc w:val="both"/>
+        <w:rPr>
+          <w:lang w:val="pl-PL"/>
+        </w:rPr>
+      </w:pPr>
+    </w:p>
+    <w:p>
+      <w:pPr>
+        <w:pStyle w:val="Akapitzlist"/>
+        <w:jc w:val="both"/>
+        <w:rPr>
+          <w:lang w:val="pl-PL"/>
+        </w:rPr>
+      </w:pPr>
+    </w:p>
+    <w:p>
+      <w:pPr>
+        <w:jc w:val="both"/>
+        <w:rPr>
+          <w:lang w:val="pl-PL"/>
+        </w:rPr>
+      </w:pPr>
+    </w:p>
+    <w:p>
+      <w:pPr>
+        <w:jc w:val="both"/>
+        <w:rPr>
+          <w:lang w:val="pl-PL"/>
+        </w:rPr>
+      </w:pPr>
+    </w:p>
+    <w:p>
+      <w:pPr>
+        <w:pStyle w:val="Akapitzlist"/>
         <w:numPr>
           <w:ilvl w:val="0"/>
           <w:numId w:val="1"/>
@@ -1294,8 +1385,8 @@
     <w:tbl>
       <w:tblPr>
         <w:tblStyle w:val="Tabela-Siatka"/>
-        <w:tblW w:w="11199" w:type="dxa"/>
-        <w:tblInd w:w="-998" w:type="dxa"/>
+        <w:tblW w:w="9357" w:type="dxa"/>
+        <w:tblInd w:w="-5" w:type="dxa"/>
         <w:tblLook w:val="04A0" w:firstRow="1" w:lastRow="0" w:firstColumn="1" w:lastColumn="0" w:noHBand="0" w:noVBand="1"/>
       </w:tblPr>
       <w:tblGrid>
@@ -1304,7 +1395,6 @@
         <w:gridCol w:w="1843"/>
         <w:gridCol w:w="1843"/>
         <w:gridCol w:w="1843"/>
-        <w:gridCol w:w="1842"/>
       </w:tblGrid>
       <w:tr>
         <w:tc>
@@ -1353,7 +1443,7 @@
                 <w:bCs/>
                 <w:lang w:val="pl-PL"/>
               </w:rPr>
-              <w:t>Długość na wyjściu (w bitach)</w:t>
+              <w:t>Długość na wyjściu [w bitach]</w:t>
             </w:r>
           </w:p>
         </w:tc>
@@ -1378,7 +1468,7 @@
                 <w:bCs/>
                 <w:lang w:val="pl-PL"/>
               </w:rPr>
-              <w:t>Czas działania (50 znaków)</w:t>
+              <w:t>Czas działania (10 MB) [s]</w:t>
             </w:r>
           </w:p>
         </w:tc>
@@ -1403,105 +1493,32 @@
                 <w:bCs/>
                 <w:lang w:val="pl-PL"/>
               </w:rPr>
-              <w:t>Czas działania (</w:t>
-            </w:r>
-            <w:r>
+              <w:t>Czas działania (100 MB) [s]</w:t>
+            </w:r>
+          </w:p>
+        </w:tc>
+        <w:tc>
+          <w:tcPr>
+            <w:tcW w:w="1843" w:type="dxa"/>
+          </w:tcPr>
+          <w:p>
+            <w:pPr>
+              <w:pStyle w:val="Akapitzlist"/>
+              <w:ind w:left="0"/>
+              <w:jc w:val="both"/>
               <w:rPr>
                 <w:b/>
                 <w:bCs/>
                 <w:lang w:val="pl-PL"/>
               </w:rPr>
-              <w:t>200</w:t>
-            </w:r>
+            </w:pPr>
             <w:r>
               <w:rPr>
                 <w:b/>
                 <w:bCs/>
                 <w:lang w:val="pl-PL"/>
               </w:rPr>
-              <w:t xml:space="preserve"> znaków)</w:t>
-            </w:r>
-          </w:p>
-        </w:tc>
-        <w:tc>
-          <w:tcPr>
-            <w:tcW w:w="1843" w:type="dxa"/>
-          </w:tcPr>
-          <w:p>
-            <w:pPr>
-              <w:pStyle w:val="Akapitzlist"/>
-              <w:ind w:left="0"/>
-              <w:jc w:val="both"/>
-              <w:rPr>
-                <w:b/>
-                <w:bCs/>
-                <w:lang w:val="pl-PL"/>
-              </w:rPr>
-            </w:pPr>
-            <w:r>
-              <w:rPr>
-                <w:b/>
-                <w:bCs/>
-                <w:lang w:val="pl-PL"/>
-              </w:rPr>
-              <w:t>Czas działania (50</w:t>
-            </w:r>
-            <w:r>
-              <w:rPr>
-                <w:b/>
-                <w:bCs/>
-                <w:lang w:val="pl-PL"/>
-              </w:rPr>
-              <w:t>0</w:t>
-            </w:r>
-            <w:r>
-              <w:rPr>
-                <w:b/>
-                <w:bCs/>
-                <w:lang w:val="pl-PL"/>
-              </w:rPr>
-              <w:t xml:space="preserve"> znaków)</w:t>
-            </w:r>
-          </w:p>
-        </w:tc>
-        <w:tc>
-          <w:tcPr>
-            <w:tcW w:w="1842" w:type="dxa"/>
-          </w:tcPr>
-          <w:p>
-            <w:pPr>
-              <w:pStyle w:val="Akapitzlist"/>
-              <w:ind w:left="0"/>
-              <w:jc w:val="both"/>
-              <w:rPr>
-                <w:b/>
-                <w:bCs/>
-                <w:lang w:val="pl-PL"/>
-              </w:rPr>
-            </w:pPr>
-            <w:r>
-              <w:rPr>
-                <w:b/>
-                <w:bCs/>
-                <w:lang w:val="pl-PL"/>
-              </w:rPr>
-              <w:t>Czas działania (</w:t>
-            </w:r>
-            <w:r>
-              <w:rPr>
-                <w:b/>
-                <w:bCs/>
-                <w:lang w:val="pl-PL"/>
-              </w:rPr>
-              <w:t>1000</w:t>
-            </w:r>
-            <w:r>
-              <w:rPr>
-                <w:b/>
-                <w:bCs/>
-                <w:lang w:val="pl-PL"/>
-              </w:rPr>
-              <w:t xml:space="preserve"> znaków)</w:t>
+              <w:t>Czas działania (500 MB) [s]</w:t>
             </w:r>
           </w:p>
         </w:tc>
@@ -1566,7 +1583,13 @@
               <w:rPr>
                 <w:lang w:val="pl-PL"/>
               </w:rPr>
-              <w:t>7.39 * 10^(-6)</w:t>
+              <w:t>0.01084</w:t>
+            </w:r>
+            <w:r>
+              <w:rPr>
+                <w:lang w:val="pl-PL"/>
+              </w:rPr>
+              <w:t xml:space="preserve"> </w:t>
             </w:r>
           </w:p>
         </w:tc>
@@ -1587,7 +1610,7 @@
               <w:rPr>
                 <w:lang w:val="pl-PL"/>
               </w:rPr>
-              <w:t>3.1 * 10^(-6)</w:t>
+              <w:t>0.11019</w:t>
             </w:r>
           </w:p>
         </w:tc>
@@ -1608,40 +1631,7 @@
               <w:rPr>
                 <w:lang w:val="pl-PL"/>
               </w:rPr>
-              <w:t>3.</w:t>
-            </w:r>
-            <w:r>
-              <w:rPr>
-                <w:lang w:val="pl-PL"/>
-              </w:rPr>
-              <w:t>1</w:t>
-            </w:r>
-            <w:r>
-              <w:rPr>
-                <w:lang w:val="pl-PL"/>
-              </w:rPr>
-              <w:t xml:space="preserve"> * 10^(-6)</w:t>
-            </w:r>
-          </w:p>
-        </w:tc>
-        <w:tc>
-          <w:tcPr>
-            <w:tcW w:w="1842" w:type="dxa"/>
-          </w:tcPr>
-          <w:p>
-            <w:pPr>
-              <w:pStyle w:val="Akapitzlist"/>
-              <w:ind w:left="0"/>
-              <w:jc w:val="both"/>
-              <w:rPr>
-                <w:lang w:val="pl-PL"/>
-              </w:rPr>
-            </w:pPr>
-            <w:r>
-              <w:rPr>
-                <w:lang w:val="pl-PL"/>
-              </w:rPr>
-              <w:t>3.58 * 10^(-6)</w:t>
+              <w:t>0.55026</w:t>
             </w:r>
           </w:p>
         </w:tc>
@@ -1706,7 +1696,13 @@
               <w:rPr>
                 <w:lang w:val="pl-PL"/>
               </w:rPr>
-              <w:t>2.62 * 10^(-6)</w:t>
+              <w:t>0.0047</w:t>
+            </w:r>
+            <w:r>
+              <w:rPr>
+                <w:lang w:val="pl-PL"/>
+              </w:rPr>
+              <w:t>1</w:t>
             </w:r>
           </w:p>
         </w:tc>
@@ -1727,7 +1723,7 @@
               <w:rPr>
                 <w:lang w:val="pl-PL"/>
               </w:rPr>
-              <w:t>1.67 * 10^(-6)</w:t>
+              <w:t>0.04316</w:t>
             </w:r>
           </w:p>
         </w:tc>
@@ -1748,28 +1744,13 @@
               <w:rPr>
                 <w:lang w:val="pl-PL"/>
               </w:rPr>
-              <w:t>1.91 * 10^(-6)</w:t>
-            </w:r>
-          </w:p>
-        </w:tc>
-        <w:tc>
-          <w:tcPr>
-            <w:tcW w:w="1842" w:type="dxa"/>
-          </w:tcPr>
-          <w:p>
-            <w:pPr>
-              <w:pStyle w:val="Akapitzlist"/>
-              <w:ind w:left="0"/>
-              <w:jc w:val="both"/>
-              <w:rPr>
-                <w:lang w:val="pl-PL"/>
-              </w:rPr>
-            </w:pPr>
-            <w:r>
-              <w:rPr>
-                <w:lang w:val="pl-PL"/>
-              </w:rPr>
-              <w:t>2.15 * 10^(-6)</w:t>
+              <w:t>0.2180</w:t>
+            </w:r>
+            <w:r>
+              <w:rPr>
+                <w:lang w:val="pl-PL"/>
+              </w:rPr>
+              <w:t>1</w:t>
             </w:r>
           </w:p>
         </w:tc>
@@ -1834,13 +1815,7 @@
               <w:rPr>
                 <w:lang w:val="pl-PL"/>
               </w:rPr>
-              <w:t xml:space="preserve">2.62 * </w:t>
-            </w:r>
-            <w:r>
-              <w:rPr>
-                <w:lang w:val="pl-PL"/>
-              </w:rPr>
-              <w:t>10^(-6)</w:t>
+              <w:t>0.00476</w:t>
             </w:r>
           </w:p>
         </w:tc>
@@ -1861,13 +1836,7 @@
               <w:rPr>
                 <w:lang w:val="pl-PL"/>
               </w:rPr>
-              <w:t xml:space="preserve">3.1 * </w:t>
-            </w:r>
-            <w:r>
-              <w:rPr>
-                <w:lang w:val="pl-PL"/>
-              </w:rPr>
-              <w:t>10^(-6)</w:t>
+              <w:t>0.04593</w:t>
             </w:r>
           </w:p>
         </w:tc>
@@ -1888,40 +1857,7 @@
               <w:rPr>
                 <w:lang w:val="pl-PL"/>
               </w:rPr>
-              <w:t xml:space="preserve">2.62 * </w:t>
-            </w:r>
-            <w:r>
-              <w:rPr>
-                <w:lang w:val="pl-PL"/>
-              </w:rPr>
-              <w:t>10^(-6)</w:t>
-            </w:r>
-          </w:p>
-        </w:tc>
-        <w:tc>
-          <w:tcPr>
-            <w:tcW w:w="1842" w:type="dxa"/>
-          </w:tcPr>
-          <w:p>
-            <w:pPr>
-              <w:pStyle w:val="Akapitzlist"/>
-              <w:ind w:left="0"/>
-              <w:jc w:val="both"/>
-              <w:rPr>
-                <w:lang w:val="pl-PL"/>
-              </w:rPr>
-            </w:pPr>
-            <w:r>
-              <w:rPr>
-                <w:lang w:val="pl-PL"/>
-              </w:rPr>
-              <w:t xml:space="preserve">3.34 </w:t>
-            </w:r>
-            <w:r>
-              <w:rPr>
-                <w:lang w:val="pl-PL"/>
-              </w:rPr>
-              <w:t>* 10^(-6)</w:t>
+              <w:t>0.23296</w:t>
             </w:r>
           </w:p>
         </w:tc>
@@ -1944,13 +1880,7 @@
               <w:rPr>
                 <w:lang w:val="pl-PL"/>
               </w:rPr>
-              <w:t>SHA-2</w:t>
-            </w:r>
-            <w:r>
-              <w:rPr>
-                <w:lang w:val="pl-PL"/>
-              </w:rPr>
-              <w:t xml:space="preserve"> (256)</w:t>
+              <w:t>SHA-2 (256)</w:t>
             </w:r>
           </w:p>
         </w:tc>
@@ -1992,13 +1922,13 @@
               <w:rPr>
                 <w:lang w:val="pl-PL"/>
               </w:rPr>
-              <w:t xml:space="preserve">2.62 </w:t>
-            </w:r>
-            <w:r>
-              <w:rPr>
-                <w:lang w:val="pl-PL"/>
-              </w:rPr>
-              <w:t>* 10^(-6)</w:t>
+              <w:t>0.0051</w:t>
+            </w:r>
+            <w:r>
+              <w:rPr>
+                <w:lang w:val="pl-PL"/>
+              </w:rPr>
+              <w:t>2</w:t>
             </w:r>
           </w:p>
         </w:tc>
@@ -2019,13 +1949,13 @@
               <w:rPr>
                 <w:lang w:val="pl-PL"/>
               </w:rPr>
-              <w:t xml:space="preserve">2.15 * </w:t>
-            </w:r>
-            <w:r>
-              <w:rPr>
-                <w:lang w:val="pl-PL"/>
-              </w:rPr>
-              <w:t>10^(-6)</w:t>
+              <w:t>0.0459</w:t>
+            </w:r>
+            <w:r>
+              <w:rPr>
+                <w:lang w:val="pl-PL"/>
+              </w:rPr>
+              <w:t>9</w:t>
             </w:r>
           </w:p>
         </w:tc>
@@ -2046,40 +1976,13 @@
               <w:rPr>
                 <w:lang w:val="pl-PL"/>
               </w:rPr>
-              <w:t xml:space="preserve">1.91 * </w:t>
-            </w:r>
-            <w:r>
-              <w:rPr>
-                <w:lang w:val="pl-PL"/>
-              </w:rPr>
-              <w:t>10^(-6)</w:t>
-            </w:r>
-          </w:p>
-        </w:tc>
-        <w:tc>
-          <w:tcPr>
-            <w:tcW w:w="1842" w:type="dxa"/>
-          </w:tcPr>
-          <w:p>
-            <w:pPr>
-              <w:pStyle w:val="Akapitzlist"/>
-              <w:ind w:left="0"/>
-              <w:jc w:val="both"/>
-              <w:rPr>
-                <w:lang w:val="pl-PL"/>
-              </w:rPr>
-            </w:pPr>
-            <w:r>
-              <w:rPr>
-                <w:lang w:val="pl-PL"/>
-              </w:rPr>
-              <w:t xml:space="preserve">2.38 * </w:t>
-            </w:r>
-            <w:r>
-              <w:rPr>
-                <w:lang w:val="pl-PL"/>
-              </w:rPr>
-              <w:t>10^(-6)</w:t>
+              <w:t>0.2350</w:t>
+            </w:r>
+            <w:r>
+              <w:rPr>
+                <w:lang w:val="pl-PL"/>
+              </w:rPr>
+              <w:t>7</w:t>
             </w:r>
           </w:p>
         </w:tc>
@@ -2102,13 +2005,7 @@
               <w:rPr>
                 <w:lang w:val="pl-PL"/>
               </w:rPr>
-              <w:t>SHA-2</w:t>
-            </w:r>
-            <w:r>
-              <w:rPr>
-                <w:lang w:val="pl-PL"/>
-              </w:rPr>
-              <w:t xml:space="preserve"> (384)</w:t>
+              <w:t>SHA-2 (384)</w:t>
             </w:r>
           </w:p>
         </w:tc>
@@ -2150,13 +2047,7 @@
               <w:rPr>
                 <w:lang w:val="pl-PL"/>
               </w:rPr>
-              <w:t xml:space="preserve">2.15 * </w:t>
-            </w:r>
-            <w:r>
-              <w:rPr>
-                <w:lang w:val="pl-PL"/>
-              </w:rPr>
-              <w:t>10^(-6)</w:t>
+              <w:t>0.01286</w:t>
             </w:r>
           </w:p>
         </w:tc>
@@ -2177,13 +2068,7 @@
               <w:rPr>
                 <w:lang w:val="pl-PL"/>
               </w:rPr>
-              <w:t xml:space="preserve">2.38 * </w:t>
-            </w:r>
-            <w:r>
-              <w:rPr>
-                <w:lang w:val="pl-PL"/>
-              </w:rPr>
-              <w:t>10^(-6)</w:t>
+              <w:t>0.09806</w:t>
             </w:r>
           </w:p>
         </w:tc>
@@ -2204,40 +2089,7 @@
               <w:rPr>
                 <w:lang w:val="pl-PL"/>
               </w:rPr>
-              <w:t xml:space="preserve">8.82 * </w:t>
-            </w:r>
-            <w:r>
-              <w:rPr>
-                <w:lang w:val="pl-PL"/>
-              </w:rPr>
-              <w:t>10^(-6)</w:t>
-            </w:r>
-          </w:p>
-        </w:tc>
-        <w:tc>
-          <w:tcPr>
-            <w:tcW w:w="1842" w:type="dxa"/>
-          </w:tcPr>
-          <w:p>
-            <w:pPr>
-              <w:pStyle w:val="Akapitzlist"/>
-              <w:ind w:left="0"/>
-              <w:jc w:val="both"/>
-              <w:rPr>
-                <w:lang w:val="pl-PL"/>
-              </w:rPr>
-            </w:pPr>
-            <w:r>
-              <w:rPr>
-                <w:lang w:val="pl-PL"/>
-              </w:rPr>
-              <w:t xml:space="preserve">3.57 * </w:t>
-            </w:r>
-            <w:r>
-              <w:rPr>
-                <w:lang w:val="pl-PL"/>
-              </w:rPr>
-              <w:t>10^(-6)</w:t>
+              <w:t>0.49419</w:t>
             </w:r>
           </w:p>
         </w:tc>
@@ -2260,13 +2112,7 @@
               <w:rPr>
                 <w:lang w:val="pl-PL"/>
               </w:rPr>
-              <w:t>SHA-2</w:t>
-            </w:r>
-            <w:r>
-              <w:rPr>
-                <w:lang w:val="pl-PL"/>
-              </w:rPr>
-              <w:t xml:space="preserve"> (512)</w:t>
+              <w:t>SHA-2 (512)</w:t>
             </w:r>
           </w:p>
         </w:tc>
@@ -2308,13 +2154,7 @@
               <w:rPr>
                 <w:lang w:val="pl-PL"/>
               </w:rPr>
-              <w:t xml:space="preserve">2.86 * </w:t>
-            </w:r>
-            <w:r>
-              <w:rPr>
-                <w:lang w:val="pl-PL"/>
-              </w:rPr>
-              <w:t>10^(-6)</w:t>
+              <w:t>0.00980</w:t>
             </w:r>
           </w:p>
         </w:tc>
@@ -2335,13 +2175,7 @@
               <w:rPr>
                 <w:lang w:val="pl-PL"/>
               </w:rPr>
-              <w:t xml:space="preserve">1.67 * </w:t>
-            </w:r>
-            <w:r>
-              <w:rPr>
-                <w:lang w:val="pl-PL"/>
-              </w:rPr>
-              <w:t>10^(-6)</w:t>
+              <w:t>0.09858</w:t>
             </w:r>
           </w:p>
         </w:tc>
@@ -2362,40 +2196,7 @@
               <w:rPr>
                 <w:lang w:val="pl-PL"/>
               </w:rPr>
-              <w:t xml:space="preserve">2.15 * </w:t>
-            </w:r>
-            <w:r>
-              <w:rPr>
-                <w:lang w:val="pl-PL"/>
-              </w:rPr>
-              <w:t>10^(-6)</w:t>
-            </w:r>
-          </w:p>
-        </w:tc>
-        <w:tc>
-          <w:tcPr>
-            <w:tcW w:w="1842" w:type="dxa"/>
-          </w:tcPr>
-          <w:p>
-            <w:pPr>
-              <w:pStyle w:val="Akapitzlist"/>
-              <w:ind w:left="0"/>
-              <w:jc w:val="both"/>
-              <w:rPr>
-                <w:lang w:val="pl-PL"/>
-              </w:rPr>
-            </w:pPr>
-            <w:r>
-              <w:rPr>
-                <w:lang w:val="pl-PL"/>
-              </w:rPr>
-              <w:t xml:space="preserve">2.62 * </w:t>
-            </w:r>
-            <w:r>
-              <w:rPr>
-                <w:lang w:val="pl-PL"/>
-              </w:rPr>
-              <w:t>10^(-6)</w:t>
+              <w:t>0.49447</w:t>
             </w:r>
           </w:p>
         </w:tc>
@@ -2418,13 +2219,7 @@
               <w:rPr>
                 <w:lang w:val="pl-PL"/>
               </w:rPr>
-              <w:t>SHA-</w:t>
-            </w:r>
-            <w:r>
-              <w:rPr>
-                <w:lang w:val="pl-PL"/>
-              </w:rPr>
-              <w:t>3 (224)</w:t>
+              <w:t>SHA-3 (224)</w:t>
             </w:r>
           </w:p>
         </w:tc>
@@ -2466,13 +2261,7 @@
               <w:rPr>
                 <w:lang w:val="pl-PL"/>
               </w:rPr>
-              <w:t xml:space="preserve">2.86 * </w:t>
-            </w:r>
-            <w:r>
-              <w:rPr>
-                <w:lang w:val="pl-PL"/>
-              </w:rPr>
-              <w:t>10^(-6)</w:t>
+              <w:t>0.01587</w:t>
             </w:r>
           </w:p>
         </w:tc>
@@ -2493,13 +2282,7 @@
               <w:rPr>
                 <w:lang w:val="pl-PL"/>
               </w:rPr>
-              <w:t xml:space="preserve">2.62 * </w:t>
-            </w:r>
-            <w:r>
-              <w:rPr>
-                <w:lang w:val="pl-PL"/>
-              </w:rPr>
-              <w:t>10^(-6)</w:t>
+              <w:t>0.15828</w:t>
             </w:r>
           </w:p>
         </w:tc>
@@ -2520,40 +2303,7 @@
               <w:rPr>
                 <w:lang w:val="pl-PL"/>
               </w:rPr>
-              <w:t xml:space="preserve">3.34 * </w:t>
-            </w:r>
-            <w:r>
-              <w:rPr>
-                <w:lang w:val="pl-PL"/>
-              </w:rPr>
-              <w:t>10^(-6)</w:t>
-            </w:r>
-          </w:p>
-        </w:tc>
-        <w:tc>
-          <w:tcPr>
-            <w:tcW w:w="1842" w:type="dxa"/>
-          </w:tcPr>
-          <w:p>
-            <w:pPr>
-              <w:pStyle w:val="Akapitzlist"/>
-              <w:ind w:left="0"/>
-              <w:jc w:val="both"/>
-              <w:rPr>
-                <w:lang w:val="pl-PL"/>
-              </w:rPr>
-            </w:pPr>
-            <w:r>
-              <w:rPr>
-                <w:lang w:val="pl-PL"/>
-              </w:rPr>
-              <w:t xml:space="preserve">4.05 * </w:t>
-            </w:r>
-            <w:r>
-              <w:rPr>
-                <w:lang w:val="pl-PL"/>
-              </w:rPr>
-              <w:t>10^(-6)</w:t>
+              <w:t>0.79466</w:t>
             </w:r>
           </w:p>
         </w:tc>
@@ -2576,13 +2326,7 @@
               <w:rPr>
                 <w:lang w:val="pl-PL"/>
               </w:rPr>
-              <w:t>SHA-</w:t>
-            </w:r>
-            <w:r>
-              <w:rPr>
-                <w:lang w:val="pl-PL"/>
-              </w:rPr>
-              <w:t>3 (256)</w:t>
+              <w:t>SHA-3 (256)</w:t>
             </w:r>
           </w:p>
         </w:tc>
@@ -2624,13 +2368,7 @@
               <w:rPr>
                 <w:lang w:val="pl-PL"/>
               </w:rPr>
-              <w:t xml:space="preserve">2.62 * </w:t>
-            </w:r>
-            <w:r>
-              <w:rPr>
-                <w:lang w:val="pl-PL"/>
-              </w:rPr>
-              <w:t>10^(-6)</w:t>
+              <w:t>0.01762</w:t>
             </w:r>
           </w:p>
         </w:tc>
@@ -2651,13 +2389,7 @@
               <w:rPr>
                 <w:lang w:val="pl-PL"/>
               </w:rPr>
-              <w:t xml:space="preserve">2.62 * </w:t>
-            </w:r>
-            <w:r>
-              <w:rPr>
-                <w:lang w:val="pl-PL"/>
-              </w:rPr>
-              <w:t>10^(-6)</w:t>
+              <w:t>0.17777</w:t>
             </w:r>
           </w:p>
         </w:tc>
@@ -2678,40 +2410,7 @@
               <w:rPr>
                 <w:lang w:val="pl-PL"/>
               </w:rPr>
-              <w:t xml:space="preserve">3.34 * </w:t>
-            </w:r>
-            <w:r>
-              <w:rPr>
-                <w:lang w:val="pl-PL"/>
-              </w:rPr>
-              <w:t>10^(-6)</w:t>
-            </w:r>
-          </w:p>
-        </w:tc>
-        <w:tc>
-          <w:tcPr>
-            <w:tcW w:w="1842" w:type="dxa"/>
-          </w:tcPr>
-          <w:p>
-            <w:pPr>
-              <w:pStyle w:val="Akapitzlist"/>
-              <w:ind w:left="0"/>
-              <w:jc w:val="both"/>
-              <w:rPr>
-                <w:lang w:val="pl-PL"/>
-              </w:rPr>
-            </w:pPr>
-            <w:r>
-              <w:rPr>
-                <w:lang w:val="pl-PL"/>
-              </w:rPr>
-              <w:t xml:space="preserve">4.77 * </w:t>
-            </w:r>
-            <w:r>
-              <w:rPr>
-                <w:lang w:val="pl-PL"/>
-              </w:rPr>
-              <w:t>10^(-6)</w:t>
+              <w:t>0.88169</w:t>
             </w:r>
           </w:p>
         </w:tc>
@@ -2734,13 +2433,7 @@
               <w:rPr>
                 <w:lang w:val="pl-PL"/>
               </w:rPr>
-              <w:t>SHA-</w:t>
-            </w:r>
-            <w:r>
-              <w:rPr>
-                <w:lang w:val="pl-PL"/>
-              </w:rPr>
-              <w:t>3 (384)</w:t>
+              <w:t>SHA-3 (384)</w:t>
             </w:r>
           </w:p>
         </w:tc>
@@ -2782,13 +2475,7 @@
               <w:rPr>
                 <w:lang w:val="pl-PL"/>
               </w:rPr>
-              <w:t xml:space="preserve">2.38 * </w:t>
-            </w:r>
-            <w:r>
-              <w:rPr>
-                <w:lang w:val="pl-PL"/>
-              </w:rPr>
-              <w:t>10^(-6)</w:t>
+              <w:t>0.02164</w:t>
             </w:r>
           </w:p>
         </w:tc>
@@ -2809,13 +2496,7 @@
               <w:rPr>
                 <w:lang w:val="pl-PL"/>
               </w:rPr>
-              <w:t xml:space="preserve">2.62 * </w:t>
-            </w:r>
-            <w:r>
-              <w:rPr>
-                <w:lang w:val="pl-PL"/>
-              </w:rPr>
-              <w:t>10^(-6)</w:t>
+              <w:t>0.21949</w:t>
             </w:r>
           </w:p>
         </w:tc>
@@ -2836,40 +2517,13 @@
               <w:rPr>
                 <w:lang w:val="pl-PL"/>
               </w:rPr>
-              <w:t xml:space="preserve">3.34 * </w:t>
-            </w:r>
-            <w:r>
-              <w:rPr>
-                <w:lang w:val="pl-PL"/>
-              </w:rPr>
-              <w:t>10^(-6)</w:t>
-            </w:r>
-          </w:p>
-        </w:tc>
-        <w:tc>
-          <w:tcPr>
-            <w:tcW w:w="1842" w:type="dxa"/>
-          </w:tcPr>
-          <w:p>
-            <w:pPr>
-              <w:pStyle w:val="Akapitzlist"/>
-              <w:ind w:left="0"/>
-              <w:jc w:val="both"/>
-              <w:rPr>
-                <w:lang w:val="pl-PL"/>
-              </w:rPr>
-            </w:pPr>
-            <w:r>
-              <w:rPr>
-                <w:lang w:val="pl-PL"/>
-              </w:rPr>
-              <w:t xml:space="preserve">4.77 * </w:t>
-            </w:r>
-            <w:r>
-              <w:rPr>
-                <w:lang w:val="pl-PL"/>
-              </w:rPr>
-              <w:t>10^(-6)</w:t>
+              <w:t>1.0963</w:t>
+            </w:r>
+            <w:r>
+              <w:rPr>
+                <w:lang w:val="pl-PL"/>
+              </w:rPr>
+              <w:t>9</w:t>
             </w:r>
           </w:p>
         </w:tc>
@@ -2892,13 +2546,7 @@
               <w:rPr>
                 <w:lang w:val="pl-PL"/>
               </w:rPr>
-              <w:t>SHA-</w:t>
-            </w:r>
-            <w:r>
-              <w:rPr>
-                <w:lang w:val="pl-PL"/>
-              </w:rPr>
-              <w:t>3 (512)</w:t>
+              <w:t>SHA-3 (512)</w:t>
             </w:r>
           </w:p>
         </w:tc>
@@ -2940,13 +2588,7 @@
               <w:rPr>
                 <w:lang w:val="pl-PL"/>
               </w:rPr>
-              <w:t xml:space="preserve">1.91 * </w:t>
-            </w:r>
-            <w:r>
-              <w:rPr>
-                <w:lang w:val="pl-PL"/>
-              </w:rPr>
-              <w:t>10^(-6)</w:t>
+              <w:t>0.03198</w:t>
             </w:r>
           </w:p>
         </w:tc>
@@ -2967,13 +2609,7 @@
               <w:rPr>
                 <w:lang w:val="pl-PL"/>
               </w:rPr>
-              <w:t xml:space="preserve">2.38 * </w:t>
-            </w:r>
-            <w:r>
-              <w:rPr>
-                <w:lang w:val="pl-PL"/>
-              </w:rPr>
-              <w:t>10^(-6)</w:t>
+              <w:t>0.31633</w:t>
             </w:r>
           </w:p>
         </w:tc>
@@ -2994,40 +2630,7 @@
               <w:rPr>
                 <w:lang w:val="pl-PL"/>
               </w:rPr>
-              <w:t xml:space="preserve">3.81 * </w:t>
-            </w:r>
-            <w:r>
-              <w:rPr>
-                <w:lang w:val="pl-PL"/>
-              </w:rPr>
-              <w:t>10^(-6)</w:t>
-            </w:r>
-          </w:p>
-        </w:tc>
-        <w:tc>
-          <w:tcPr>
-            <w:tcW w:w="1842" w:type="dxa"/>
-          </w:tcPr>
-          <w:p>
-            <w:pPr>
-              <w:pStyle w:val="Akapitzlist"/>
-              <w:ind w:left="0"/>
-              <w:jc w:val="both"/>
-              <w:rPr>
-                <w:lang w:val="pl-PL"/>
-              </w:rPr>
-            </w:pPr>
-            <w:r>
-              <w:rPr>
-                <w:lang w:val="pl-PL"/>
-              </w:rPr>
-              <w:t xml:space="preserve">5.72 * </w:t>
-            </w:r>
-            <w:r>
-              <w:rPr>
-                <w:lang w:val="pl-PL"/>
-              </w:rPr>
-              <w:t>10^(-6)</w:t>
+              <w:t>1.58012</w:t>
             </w:r>
           </w:p>
         </w:tc>
@@ -3363,13 +2966,13 @@
         <w:rPr>
           <w:lang w:val="pl-PL"/>
         </w:rPr>
-        <w:t>50</w:t>
-      </w:r>
-      <w:r>
-        <w:rPr>
-          <w:lang w:val="pl-PL"/>
-        </w:rPr>
-        <w:t xml:space="preserve"> do 1000 znaków), dany algorytm zawsze generuje skrót o identycznej liczbie znaków</w:t>
+        <w:t>10 do 500 MB</w:t>
+      </w:r>
+      <w:r>
+        <w:rPr>
+          <w:lang w:val="pl-PL"/>
+        </w:rPr>
+        <w:t>), dany algorytm zawsze generuje skrót o identycznej liczbie znaków</w:t>
       </w:r>
       <w:r>
         <w:rPr>
@@ -3381,19 +2984,31 @@
         <w:rPr>
           <w:lang w:val="pl-PL"/>
         </w:rPr>
-        <w:t>obliczeń rośnie bardzo powoli wraz ze wzrostem objętości danych</w:t>
-      </w:r>
-      <w:r>
-        <w:rPr>
-          <w:lang w:val="pl-PL"/>
-        </w:rPr>
-        <w:t xml:space="preserve">, ale nie we wszystkich algorytmach (np. dla SHA-2 224). Dla 50 znaków większość algorytmów potrzebowała więcej czasu. </w:t>
-      </w:r>
-      <w:r>
-        <w:rPr>
-          <w:lang w:val="pl-PL"/>
-        </w:rPr>
-        <w:t>Algorytmy z rodziny SHA-3 oraz wersje o dłuższych skrótach wymagają zazwyczaj nieco więcej operacji, co jest widoczne przy przetwarzaniu większych bloków danych</w:t>
+        <w:t>obliczeń rośnie wraz ze wzrostem objętości danych</w:t>
+      </w:r>
+      <w:r>
+        <w:rPr>
+          <w:lang w:val="pl-PL"/>
+        </w:rPr>
+        <w:t xml:space="preserve">. </w:t>
+      </w:r>
+      <w:r>
+        <w:rPr>
+          <w:lang w:val="pl-PL"/>
+        </w:rPr>
+        <w:t xml:space="preserve">Algorytmy z rodziny SHA-3 wymagają nieco więcej operacji, co jest </w:t>
+      </w:r>
+      <w:r>
+        <w:rPr>
+          <w:lang w:val="pl-PL"/>
+        </w:rPr>
+        <w:t xml:space="preserve">szczególnie </w:t>
+      </w:r>
+      <w:r>
+        <w:rPr>
+          <w:lang w:val="pl-PL"/>
+        </w:rPr>
+        <w:t>widoczne przy przetwarzaniu większych bloków danych</w:t>
       </w:r>
       <w:r>
         <w:rPr>
@@ -4950,6 +4565,7 @@
   <w:style w:type="character" w:default="1" w:styleId="Domylnaczcionkaakapitu">
     <w:name w:val="Default Paragraph Font"/>
     <w:uiPriority w:val="1"/>
+    <w:semiHidden/>
     <w:unhideWhenUsed/>
   </w:style>
   <w:style w:type="table" w:default="1" w:styleId="Standardowy">

</xml_diff>